<commit_message>
update report chương 1
</commit_message>
<xml_diff>
--- a/Report/XÂY DỰNG HỆ THỐNG NHẬN DIỆN MŨ BẢO HIỂM TRONG MÔI TRƯỜNG GIAO THÔNG THỰC TẾ BẰNG MÔ HÌNH PHÁT HIỆN ĐỐI TƯỢNG.docx
+++ b/Report/XÂY DỰNG HỆ THỐNG NHẬN DIỆN MŨ BẢO HIỂM TRONG MÔI TRƯỜNG GIAO THÔNG THỰC TẾ BẰNG MÔ HÌNH PHÁT HIỆN ĐỐI TƯỢNG.docx
@@ -2663,6 +2663,14 @@
     </w:p>
     <w:p>
       <w:pPr>
+        <w:pStyle w:val="Nidungvnbn"/>
+      </w:pPr>
+      <w:r>
+        <w:t>Chất lượng của mô hình phát hiện đối tượng phụ thuộc trực tiếp vào chất lượng và đặc trưng của dữ liệu huấn luyện. Do đó, trước khi tiến hành xây dựng và huấn luyện mô hình, việc phân tích tổng quan dataset là một bước cần thiết nhằm đánh giá cấu trúc dữ liệu, mức độ phân bố giữa các tập train/valid/test, số lượng đối tượng được annotation, cũng như sự cân bằng giữa các class trong dữ liệu.</w:t>
+      </w:r>
+    </w:p>
+    <w:p>
+      <w:pPr>
         <w:pStyle w:val="Heading3"/>
       </w:pPr>
       <w:r>
@@ -2671,6 +2679,72 @@
     </w:p>
     <w:p>
       <w:pPr>
+        <w:pStyle w:val="Nidungvnbn"/>
+      </w:pPr>
+      <w:r>
+        <w:t>Dataset được sử dụng trong đề tài này được thu thập từ nền tảng Roboflow Universe [ref1]. Bộ dữ liệu thuộc bài toán Helmet Detection, bao gồm các ảnh giao thông thực tế có chứa người tham gia giao thông, xe máy, mũ bảo hiểm và một số đối tượng liên quan.</w:t>
+      </w:r>
+    </w:p>
+    <w:p>
+      <w:pPr>
+        <w:pStyle w:val="Nidungvnbn"/>
+      </w:pPr>
+      <w:r>
+        <w:t>Theo thông tin từ nguồn dữ liệu, dataset có nhiều phiên bản khác nhau. Trong đề tài này, phiên bản được sử dụng là Helmet9. Đây là phiên bản đã được tiền xử lý và xuất dữ liệu theo định dạng YOLO, phù hợp cho các bài toán phát hiện đối tượng dựa trên bounding box.</w:t>
+      </w:r>
+    </w:p>
+    <w:p>
+      <w:pPr>
+        <w:pStyle w:val="Nidungvnbn"/>
+      </w:pPr>
+      <w:r>
+        <w:t>Dữ liệu được chia thành ba tập chính, mỗi tập phục vụ một vai trò khác nhau trong quá trình xây dựng mô hình:</w:t>
+      </w:r>
+    </w:p>
+    <w:p>
+      <w:pPr>
+        <w:pStyle w:val="Nidungvnbn"/>
+        <w:numPr>
+          <w:ilvl w:val="0"/>
+          <w:numId w:val="32"/>
+        </w:numPr>
+      </w:pPr>
+      <w:r>
+        <w:t>Train: Dữ liệu được sử dụng trực tiếp trong quá trình huấn luyện model.</w:t>
+      </w:r>
+    </w:p>
+    <w:p>
+      <w:pPr>
+        <w:pStyle w:val="Nidungvnbn"/>
+        <w:numPr>
+          <w:ilvl w:val="0"/>
+          <w:numId w:val="32"/>
+        </w:numPr>
+      </w:pPr>
+      <w:r>
+        <w:t>Valid: Dữ liệu được sử dụng để đánh giá model trong quá trình huấn luyện, hỗ trợ theo dõi khả năng học và điều chỉnh mô hình sau mỗi số vòng lặp nhất địn</w:t>
+      </w:r>
+      <w:r>
+        <w:t>h</w:t>
+      </w:r>
+      <w:r>
+        <w:t>.</w:t>
+      </w:r>
+    </w:p>
+    <w:p>
+      <w:pPr>
+        <w:pStyle w:val="Nidungvnbn"/>
+        <w:numPr>
+          <w:ilvl w:val="0"/>
+          <w:numId w:val="32"/>
+        </w:numPr>
+      </w:pPr>
+      <w:r>
+        <w:t>Test: Dữ liệu được sử dụng để đánh giá model cuối cùng sau khi quá trình huấn luyện hoàn tất.</w:t>
+      </w:r>
+    </w:p>
+    <w:p>
+      <w:pPr>
         <w:pStyle w:val="Heading3"/>
       </w:pPr>
       <w:r>
@@ -2679,6 +2753,18 @@
     </w:p>
     <w:p>
       <w:pPr>
+        <w:pStyle w:val="Nidungvnbn"/>
+      </w:pPr>
+      <w:r>
+        <w:t xml:space="preserve">Dataset bao gồm tổng cộng 2121 ảnh, được phân chia thành ba tập train, valid và test. Tỷ lệ phân bố dữ liệu lần lượt xấp xỉ 69%, 19% và 12%. Đây là một tỷ lệ </w:t>
+      </w:r>
+      <w:r>
+        <w:lastRenderedPageBreak/>
+        <w:t>tương đối hợp lý đối với bài toán huấn luyện mô hình phát hiện đối tượng, trong đó phần lớn dữ liệu được dành cho quá trình train, đồng thời vẫn giữ lại một lượng dữ liệu nhất định cho valid và test nhằm phục vụ việc đánh giá.</w:t>
+      </w:r>
+    </w:p>
+    <w:p>
+      <w:pPr>
         <w:pStyle w:val="Heading3"/>
       </w:pPr>
       <w:r>
@@ -2687,10 +2773,143 @@
     </w:p>
     <w:p>
       <w:pPr>
+        <w:pStyle w:val="Heading4"/>
+      </w:pPr>
+      <w:r>
+        <w:t>Số lớp</w:t>
+      </w:r>
+    </w:p>
+    <w:p>
+      <w:pPr>
         <w:pStyle w:val="Nidungvnbn"/>
       </w:pPr>
       <w:r>
-        <w:t>// ở đây nói tổng quan về dữ liệu, đã được preprocess, format như thế nào,…</w:t>
+        <w:t>Dataset bao gồm 6 class, tương ứng với 6 class_id trong dữ liệu annotation, bao gồm: bike, helmet, lisc, no_helmet, noise và rider.</w:t>
+      </w:r>
+    </w:p>
+    <w:p>
+      <w:pPr>
+        <w:pStyle w:val="Nidungvnbn"/>
+      </w:pPr>
+      <w:r>
+        <w:t>Ở giai đoạn này, các class được thống kê ở mức tổng quan nhằm cung cấp cái nhìn ban đầu về cấu trúc dữ liệu. Việc phân tích chi tiết chất lượng annotation của từng class sẽ được trình bày ở phần sau.</w:t>
+      </w:r>
+    </w:p>
+    <w:p>
+      <w:pPr>
+        <w:pStyle w:val="Heading4"/>
+      </w:pPr>
+      <w:r>
+        <w:t>Kiểm tra kích thước hình ảnh</w:t>
+      </w:r>
+    </w:p>
+    <w:p>
+      <w:pPr>
+        <w:pStyle w:val="Nidungvnbn"/>
+      </w:pPr>
+      <w:r>
+        <w:t>Theo thông tin từ Roboflow, toàn bộ ảnh trong dataset đã được tiền xử lý về kích thước 1024x1024. Điều này cho thấy dữ liệu đã được chuẩn hóa về mặt kích thước trước khi đưa vào quá trình huấn luyện.</w:t>
+      </w:r>
+    </w:p>
+    <w:p>
+      <w:pPr>
+        <w:pStyle w:val="Nidungvnbn"/>
+      </w:pPr>
+      <w:r>
+        <w:t>Việc kiểm tra kích thước ảnh là cần thiết trong bài toán object detection, vì kích thước đầu vào có thể ảnh hưởng đến khả năng học đặc trưng của model. Nếu dataset chứa nhiều ảnh có kích thước quá khác biệt, quá nhỏ hoặc có aspect ratio bất thường, quá trình resize trong lúc train có thể làm biến dạng đối tượng hoặc làm mất chi tiết của các đối tượng nhỏ.</w:t>
+      </w:r>
+    </w:p>
+    <w:p>
+      <w:pPr>
+        <w:pStyle w:val="Nidungvnbn"/>
+      </w:pPr>
+      <w:r>
+        <w:drawing>
+          <wp:inline distT="0" distB="0" distL="0" distR="0" wp14:anchorId="00340DF5" wp14:editId="680819A9">
+            <wp:extent cx="3905795" cy="1581371"/>
+            <wp:effectExtent l="0" t="0" r="0" b="0"/>
+            <wp:docPr id="11671064" name="Picture 1"/>
+            <wp:cNvGraphicFramePr>
+              <a:graphicFrameLocks xmlns:a="http://schemas.openxmlformats.org/drawingml/2006/main" noChangeAspect="1"/>
+            </wp:cNvGraphicFramePr>
+            <a:graphic xmlns:a="http://schemas.openxmlformats.org/drawingml/2006/main">
+              <a:graphicData uri="http://schemas.openxmlformats.org/drawingml/2006/picture">
+                <pic:pic xmlns:pic="http://schemas.openxmlformats.org/drawingml/2006/picture">
+                  <pic:nvPicPr>
+                    <pic:cNvPr id="11671064" name=""/>
+                    <pic:cNvPicPr/>
+                  </pic:nvPicPr>
+                  <pic:blipFill>
+                    <a:blip r:embed="rId10"/>
+                    <a:stretch>
+                      <a:fillRect/>
+                    </a:stretch>
+                  </pic:blipFill>
+                  <pic:spPr>
+                    <a:xfrm>
+                      <a:off x="0" y="0"/>
+                      <a:ext cx="3905795" cy="1581371"/>
+                    </a:xfrm>
+                    <a:prstGeom prst="rect">
+                      <a:avLst/>
+                    </a:prstGeom>
+                  </pic:spPr>
+                </pic:pic>
+              </a:graphicData>
+            </a:graphic>
+          </wp:inline>
+        </w:drawing>
+      </w:r>
+    </w:p>
+    <w:p>
+      <w:pPr>
+        <w:pStyle w:val="Nidungvnbn"/>
+      </w:pPr>
+      <w:r>
+        <w:lastRenderedPageBreak/>
+        <w:drawing>
+          <wp:inline distT="0" distB="0" distL="0" distR="0" wp14:anchorId="7DA66B7C" wp14:editId="74767705">
+            <wp:extent cx="4163006" cy="3524742"/>
+            <wp:effectExtent l="0" t="0" r="9525" b="0"/>
+            <wp:docPr id="1863056384" name="Picture 1"/>
+            <wp:cNvGraphicFramePr>
+              <a:graphicFrameLocks xmlns:a="http://schemas.openxmlformats.org/drawingml/2006/main" noChangeAspect="1"/>
+            </wp:cNvGraphicFramePr>
+            <a:graphic xmlns:a="http://schemas.openxmlformats.org/drawingml/2006/main">
+              <a:graphicData uri="http://schemas.openxmlformats.org/drawingml/2006/picture">
+                <pic:pic xmlns:pic="http://schemas.openxmlformats.org/drawingml/2006/picture">
+                  <pic:nvPicPr>
+                    <pic:cNvPr id="1863056384" name=""/>
+                    <pic:cNvPicPr/>
+                  </pic:nvPicPr>
+                  <pic:blipFill>
+                    <a:blip r:embed="rId11"/>
+                    <a:stretch>
+                      <a:fillRect/>
+                    </a:stretch>
+                  </pic:blipFill>
+                  <pic:spPr>
+                    <a:xfrm>
+                      <a:off x="0" y="0"/>
+                      <a:ext cx="4163006" cy="3524742"/>
+                    </a:xfrm>
+                    <a:prstGeom prst="rect">
+                      <a:avLst/>
+                    </a:prstGeom>
+                  </pic:spPr>
+                </pic:pic>
+              </a:graphicData>
+            </a:graphic>
+          </wp:inline>
+        </w:drawing>
+      </w:r>
+    </w:p>
+    <w:p>
+      <w:pPr>
+        <w:pStyle w:val="Nidungvnbn"/>
+      </w:pPr>
+      <w:r>
+        <w:t>Để kiểm chứng lại thông tin này, đề tài tiến hành kiểm tra kích thước ảnh bằng Python. Kết quả cho thấy toàn bộ 2121 ảnh trong dataset đều có cùng kích thước chiều rộng và chiều cao. Bên cạnh đó, việc kiểm tra outliers bằng phương pháp IQR cũng không phát hiện ảnh có kích thước hoặc aspect ratio bất thường. Từ kết quả trên, có thể kết luận rằng dataset đã được tiền xử lý tương đối tốt về mặt kích thước và không cần thực hiện thêm bước chuẩn hóa kích thước ảnh ở giai đoạn EDA.</w:t>
       </w:r>
     </w:p>
     <w:p>
@@ -2704,7 +2923,7 @@
         <w:rPr>
           <w:lang w:val="en-US"/>
         </w:rPr>
-        <w:t>Phân bố lớp của dữ liệu</w:t>
+        <w:t>Phân tích về bouding box</w:t>
       </w:r>
     </w:p>
     <w:p>
@@ -2712,7 +2931,58 @@
         <w:pStyle w:val="Nidungvnbn"/>
       </w:pPr>
       <w:r>
-        <w:t>// ở đây phân tích về bb theo từng lớp, có bị mất cân bằng các lớp hay không, lớp nào nhiều, lớp nào ít</w:t>
+        <w:drawing>
+          <wp:inline distT="0" distB="0" distL="0" distR="0" wp14:anchorId="691901B8" wp14:editId="173905A6">
+            <wp:extent cx="5579745" cy="1031240"/>
+            <wp:effectExtent l="0" t="0" r="1905" b="0"/>
+            <wp:docPr id="1438061188" name="Picture 1"/>
+            <wp:cNvGraphicFramePr>
+              <a:graphicFrameLocks xmlns:a="http://schemas.openxmlformats.org/drawingml/2006/main" noChangeAspect="1"/>
+            </wp:cNvGraphicFramePr>
+            <a:graphic xmlns:a="http://schemas.openxmlformats.org/drawingml/2006/main">
+              <a:graphicData uri="http://schemas.openxmlformats.org/drawingml/2006/picture">
+                <pic:pic xmlns:pic="http://schemas.openxmlformats.org/drawingml/2006/picture">
+                  <pic:nvPicPr>
+                    <pic:cNvPr id="1438061188" name=""/>
+                    <pic:cNvPicPr/>
+                  </pic:nvPicPr>
+                  <pic:blipFill>
+                    <a:blip r:embed="rId12"/>
+                    <a:stretch>
+                      <a:fillRect/>
+                    </a:stretch>
+                  </pic:blipFill>
+                  <pic:spPr>
+                    <a:xfrm>
+                      <a:off x="0" y="0"/>
+                      <a:ext cx="5579745" cy="1031240"/>
+                    </a:xfrm>
+                    <a:prstGeom prst="rect">
+                      <a:avLst/>
+                    </a:prstGeom>
+                  </pic:spPr>
+                </pic:pic>
+              </a:graphicData>
+            </a:graphic>
+          </wp:inline>
+        </w:drawing>
+      </w:r>
+    </w:p>
+    <w:p>
+      <w:pPr>
+        <w:pStyle w:val="Nidungvnbn"/>
+      </w:pPr>
+      <w:r>
+        <w:t>Mỗi ảnh trong dataset có trung bình khoảng 10 bounding box. Đây là một đặc điểm tích cực, vì mặc dù tập train chỉ bao gồm 1462 ảnh, số lượng bounding box thu được lên đến 16013. Điều này cho thấy dữ liệu chứa nhiều đối tượng trong mỗi ảnh, phù hợp với bối cảnh giao thông thực tế, nơi thường xuất hiện nhiều phương tiện và người tham gia giao thông cùng lúc.</w:t>
+      </w:r>
+    </w:p>
+    <w:p>
+      <w:pPr>
+        <w:pStyle w:val="Nidungvnbn"/>
+      </w:pPr>
+      <w:r>
+        <w:lastRenderedPageBreak/>
+        <w:t>Tuy nhiên, quá trình thống kê cũng phát hiện trong tập train có 2 ảnh không chứa bất kỳ annotation nào. Đây là một điểm cần được kiểm tra kỹ hơn, vì ảnh không có annotation có thể là ảnh không chứa đối tượng cần phát hiện, hoặc cũng có thể là lỗi thiếu nhãn trong quá trình xây dựng dataset. Vấn đề này sẽ được phân tích và xử lý chi tiết hơn ở phần annotation analysis.</w:t>
       </w:r>
     </w:p>
     <w:p>
@@ -2726,7 +2996,13 @@
         <w:rPr>
           <w:lang w:val="en-US"/>
         </w:rPr>
-        <w:t>Phân tích về bouding box</w:t>
+        <w:t xml:space="preserve">Phân </w:t>
+      </w:r>
+      <w:r>
+        <w:rPr>
+          <w:lang w:val="en-US"/>
+        </w:rPr>
+        <w:t>bố lớp của dữ liệu</w:t>
       </w:r>
     </w:p>
     <w:p>
@@ -2734,7 +3010,186 @@
         <w:pStyle w:val="Nidungvnbn"/>
       </w:pPr>
       <w:r>
-        <w:t>// Ở đây nên phân tích theo từng class, để xem rằng bounding box của từng class bọc đối tượng như thế nào</w:t>
+        <w:t>Sau khi kiểm tra tổng quan số lượng ảnh và bounding box, bước tiếp theo là phân tích phân bố của các class trong dataset. Việc này nhằm đánh giá mức độ cân bằng dữ liệu giữa các class, đồng thời xác định các class chiếm ưu thế hoặc có số lượng annotation thấp.</w:t>
+      </w:r>
+    </w:p>
+    <w:p>
+      <w:pPr>
+        <w:pStyle w:val="Nidungvnbn"/>
+      </w:pPr>
+      <w:r>
+        <w:t>Trong phần này, phân bố lớp được đánh giá dựa trên số lượng bounding box của từng class. Lý do là trong bài toán object detection, mỗi bounding box đại diện cho một đối tượng được gán nhãn, qua đó cung cấp thông tin trực tiếp cho model về vị trí và loại đối tượng cần học.</w:t>
+      </w:r>
+    </w:p>
+    <w:p>
+      <w:pPr>
+        <w:pStyle w:val="Heading3"/>
+      </w:pPr>
+      <w:r>
+        <w:t>Phân bố lớp toàn bộ dữ liệu</w:t>
+      </w:r>
+    </w:p>
+    <w:p>
+      <w:pPr>
+        <w:pStyle w:val="Nidungvnbn"/>
+      </w:pPr>
+      <w:r>
+        <w:lastRenderedPageBreak/>
+        <w:drawing>
+          <wp:inline distT="0" distB="0" distL="0" distR="0" wp14:anchorId="7565D600" wp14:editId="47A00CAE">
+            <wp:extent cx="5579745" cy="4155440"/>
+            <wp:effectExtent l="0" t="0" r="1905" b="0"/>
+            <wp:docPr id="480374984" name="Picture 1"/>
+            <wp:cNvGraphicFramePr>
+              <a:graphicFrameLocks xmlns:a="http://schemas.openxmlformats.org/drawingml/2006/main" noChangeAspect="1"/>
+            </wp:cNvGraphicFramePr>
+            <a:graphic xmlns:a="http://schemas.openxmlformats.org/drawingml/2006/main">
+              <a:graphicData uri="http://schemas.openxmlformats.org/drawingml/2006/picture">
+                <pic:pic xmlns:pic="http://schemas.openxmlformats.org/drawingml/2006/picture">
+                  <pic:nvPicPr>
+                    <pic:cNvPr id="480374984" name=""/>
+                    <pic:cNvPicPr/>
+                  </pic:nvPicPr>
+                  <pic:blipFill>
+                    <a:blip r:embed="rId13"/>
+                    <a:stretch>
+                      <a:fillRect/>
+                    </a:stretch>
+                  </pic:blipFill>
+                  <pic:spPr>
+                    <a:xfrm>
+                      <a:off x="0" y="0"/>
+                      <a:ext cx="5579745" cy="4155440"/>
+                    </a:xfrm>
+                    <a:prstGeom prst="rect">
+                      <a:avLst/>
+                    </a:prstGeom>
+                  </pic:spPr>
+                </pic:pic>
+              </a:graphicData>
+            </a:graphic>
+          </wp:inline>
+        </w:drawing>
+      </w:r>
+    </w:p>
+    <w:p>
+      <w:pPr>
+        <w:pStyle w:val="Nidungvnbn"/>
+      </w:pPr>
+      <w:r>
+        <w:t>Kết quả thống kê cho thấy class rider là class có số lượng bounding box nhiều nhất, với 6366 bounding box. Ngược lại, class noise là class có số lượng bounding box thấp nhất. Đây là một điểm đáng chú ý, vì noise thường được hiểu là yếu tố gây nhiễu hoặc không thuộc nhóm đối tượng chính cần quan tâm. Tuy nhiên, trong dataset này, noise lại được annotation thành một class riêng. Do đó, ý nghĩa và vai trò của class này cần được phân tích kỹ hơn trong phần annotation analysis.</w:t>
+      </w:r>
+    </w:p>
+    <w:p>
+      <w:pPr>
+        <w:pStyle w:val="Heading3"/>
+      </w:pPr>
+      <w:r>
+        <w:t>Phân bố lớp cho từng tập dữ liệu</w:t>
+      </w:r>
+    </w:p>
+    <w:p>
+      <w:pPr>
+        <w:pStyle w:val="Nidungvnbn"/>
+      </w:pPr>
+      <w:r>
+        <w:lastRenderedPageBreak/>
+        <w:drawing>
+          <wp:inline distT="0" distB="0" distL="0" distR="0" wp14:anchorId="0190D69D" wp14:editId="16FBBF22">
+            <wp:extent cx="5579745" cy="2752090"/>
+            <wp:effectExtent l="0" t="0" r="1905" b="0"/>
+            <wp:docPr id="1337007773" name="Picture 1"/>
+            <wp:cNvGraphicFramePr>
+              <a:graphicFrameLocks xmlns:a="http://schemas.openxmlformats.org/drawingml/2006/main" noChangeAspect="1"/>
+            </wp:cNvGraphicFramePr>
+            <a:graphic xmlns:a="http://schemas.openxmlformats.org/drawingml/2006/main">
+              <a:graphicData uri="http://schemas.openxmlformats.org/drawingml/2006/picture">
+                <pic:pic xmlns:pic="http://schemas.openxmlformats.org/drawingml/2006/picture">
+                  <pic:nvPicPr>
+                    <pic:cNvPr id="1337007773" name=""/>
+                    <pic:cNvPicPr/>
+                  </pic:nvPicPr>
+                  <pic:blipFill>
+                    <a:blip r:embed="rId14"/>
+                    <a:stretch>
+                      <a:fillRect/>
+                    </a:stretch>
+                  </pic:blipFill>
+                  <pic:spPr>
+                    <a:xfrm>
+                      <a:off x="0" y="0"/>
+                      <a:ext cx="5579745" cy="2752090"/>
+                    </a:xfrm>
+                    <a:prstGeom prst="rect">
+                      <a:avLst/>
+                    </a:prstGeom>
+                  </pic:spPr>
+                </pic:pic>
+              </a:graphicData>
+            </a:graphic>
+          </wp:inline>
+        </w:drawing>
+      </w:r>
+    </w:p>
+    <w:p>
+      <w:pPr>
+        <w:pStyle w:val="Nidungvnbn"/>
+      </w:pPr>
+      <w:r>
+        <w:t>Sau khi quan sát phân bố class trên toàn bộ dataset, đề tài tiếp tục kiểm tra phân bố class riêng trong từng tập train, valid và test. Việc này giúp đánh giá liệu cách chia dữ liệu có giữ được đặc điểm phân bố tương đối nhất quán giữa các tập hay không.</w:t>
+      </w:r>
+    </w:p>
+    <w:p>
+      <w:pPr>
+        <w:pStyle w:val="Nidungvnbn"/>
+      </w:pPr>
+      <w:r>
+        <w:t>Kết quả cho thấy tập valid và test có xu hướng phân bố class tương tự tập train. Cụ thể, rider vẫn là class chiếm ưu thế, trong khi noise là class có số lượng annotation thấp nhất. Điều này cho thấy quá trình chia dữ liệu nhìn chung vẫn duy trì được xu hướng phân bố class của toàn bộ dataset.</w:t>
+      </w:r>
+    </w:p>
+    <w:p>
+      <w:pPr>
+        <w:pStyle w:val="Heading2"/>
+        <w:rPr>
+          <w:lang w:val="en-US"/>
+        </w:rPr>
+      </w:pPr>
+      <w:r>
+        <w:rPr>
+          <w:lang w:val="en-US"/>
+        </w:rPr>
+        <w:t>Kết luận từ quá trình phân tích dữ liệu</w:t>
+      </w:r>
+    </w:p>
+    <w:p>
+      <w:pPr>
+        <w:pStyle w:val="Nidungvnbn"/>
+      </w:pPr>
+      <w:r>
+        <w:t>Từ các kết quả phân tích ban đầu, có thể thấy dataset đã được chuẩn hóa tốt về kích thước ảnh, đồng thời có số lượng bounding box tương đối lớn so với số lượng ảnh. Điều này tạo điều kiện thuận lợi cho quá trình huấn luyện model phát hiện đối tượng.</w:t>
+      </w:r>
+    </w:p>
+    <w:p>
+      <w:pPr>
+        <w:pStyle w:val="Nidungvnbn"/>
+      </w:pPr>
+      <w:r>
+        <w:t xml:space="preserve">Tuy nhiên, phân tích tổng quan cũng cho thấy một số vấn đề cần được xem xét sâu hơn. Thứ nhất, trong tập train tồn tại 2 ảnh không có annotation, cần được kiểm tra để xác định đây là ảnh không chứa đối tượng hay lỗi thiếu nhãn. Thứ hai, ý nghĩa của một số class, đặc biệt là noise, vẫn chưa thật sự rõ ràng nếu chỉ nhìn từ thống kê số lượng. Thứ ba, hai class quan trọng nhất đối với mục tiêu của đề tài là helmet và no_helmet có số lượng bounding box thấp hơn so với rider, bike và lisc. Điều này </w:t>
+      </w:r>
+      <w:r>
+        <w:lastRenderedPageBreak/>
+        <w:t>cho thấy cần tiếp tục phân tích chất lượng annotation của từng class để đánh giá rõ hơn khả năng sử dụng dữ liệu cho quá trình huấn luyện.</w:t>
+      </w:r>
+    </w:p>
+    <w:p>
+      <w:pPr>
+        <w:pStyle w:val="Heading1"/>
+      </w:pPr>
+      <w:r>
+        <w:rPr>
+          <w:lang w:val="en-US"/>
+        </w:rPr>
+        <w:t>PHÂN TÍCH ANNOTATION CHO TỪNG CLASS</w:t>
       </w:r>
     </w:p>
     <w:p>
@@ -4884,6 +5339,118 @@
     </w:lvl>
   </w:abstractNum>
   <w:abstractNum w:abstractNumId="18" w15:restartNumberingAfterBreak="0">
+    <w:nsid w:val="68B239EF"/>
+    <w:multiLevelType w:val="hybridMultilevel"/>
+    <w:tmpl w:val="12F0C786"/>
+    <w:lvl w:ilvl="0" w:tplc="01C2B2E2">
+      <w:numFmt w:val="bullet"/>
+      <w:lvlText w:val="-"/>
+      <w:lvlJc w:val="left"/>
+      <w:pPr>
+        <w:ind w:left="1080" w:hanging="360"/>
+      </w:pPr>
+      <w:rPr>
+        <w:rFonts w:ascii="Times New Roman" w:eastAsiaTheme="minorHAnsi" w:hAnsi="Times New Roman" w:cs="Times New Roman" w:hint="default"/>
+      </w:rPr>
+    </w:lvl>
+    <w:lvl w:ilvl="1" w:tplc="04090003" w:tentative="1">
+      <w:start w:val="1"/>
+      <w:numFmt w:val="bullet"/>
+      <w:lvlText w:val="o"/>
+      <w:lvlJc w:val="left"/>
+      <w:pPr>
+        <w:ind w:left="1800" w:hanging="360"/>
+      </w:pPr>
+      <w:rPr>
+        <w:rFonts w:ascii="Courier New" w:hAnsi="Courier New" w:cs="Courier New" w:hint="default"/>
+      </w:rPr>
+    </w:lvl>
+    <w:lvl w:ilvl="2" w:tplc="04090005" w:tentative="1">
+      <w:start w:val="1"/>
+      <w:numFmt w:val="bullet"/>
+      <w:lvlText w:val=""/>
+      <w:lvlJc w:val="left"/>
+      <w:pPr>
+        <w:ind w:left="2520" w:hanging="360"/>
+      </w:pPr>
+      <w:rPr>
+        <w:rFonts w:ascii="Wingdings" w:hAnsi="Wingdings" w:hint="default"/>
+      </w:rPr>
+    </w:lvl>
+    <w:lvl w:ilvl="3" w:tplc="04090001" w:tentative="1">
+      <w:start w:val="1"/>
+      <w:numFmt w:val="bullet"/>
+      <w:lvlText w:val=""/>
+      <w:lvlJc w:val="left"/>
+      <w:pPr>
+        <w:ind w:left="3240" w:hanging="360"/>
+      </w:pPr>
+      <w:rPr>
+        <w:rFonts w:ascii="Symbol" w:hAnsi="Symbol" w:hint="default"/>
+      </w:rPr>
+    </w:lvl>
+    <w:lvl w:ilvl="4" w:tplc="04090003" w:tentative="1">
+      <w:start w:val="1"/>
+      <w:numFmt w:val="bullet"/>
+      <w:lvlText w:val="o"/>
+      <w:lvlJc w:val="left"/>
+      <w:pPr>
+        <w:ind w:left="3960" w:hanging="360"/>
+      </w:pPr>
+      <w:rPr>
+        <w:rFonts w:ascii="Courier New" w:hAnsi="Courier New" w:cs="Courier New" w:hint="default"/>
+      </w:rPr>
+    </w:lvl>
+    <w:lvl w:ilvl="5" w:tplc="04090005" w:tentative="1">
+      <w:start w:val="1"/>
+      <w:numFmt w:val="bullet"/>
+      <w:lvlText w:val=""/>
+      <w:lvlJc w:val="left"/>
+      <w:pPr>
+        <w:ind w:left="4680" w:hanging="360"/>
+      </w:pPr>
+      <w:rPr>
+        <w:rFonts w:ascii="Wingdings" w:hAnsi="Wingdings" w:hint="default"/>
+      </w:rPr>
+    </w:lvl>
+    <w:lvl w:ilvl="6" w:tplc="04090001" w:tentative="1">
+      <w:start w:val="1"/>
+      <w:numFmt w:val="bullet"/>
+      <w:lvlText w:val=""/>
+      <w:lvlJc w:val="left"/>
+      <w:pPr>
+        <w:ind w:left="5400" w:hanging="360"/>
+      </w:pPr>
+      <w:rPr>
+        <w:rFonts w:ascii="Symbol" w:hAnsi="Symbol" w:hint="default"/>
+      </w:rPr>
+    </w:lvl>
+    <w:lvl w:ilvl="7" w:tplc="04090003" w:tentative="1">
+      <w:start w:val="1"/>
+      <w:numFmt w:val="bullet"/>
+      <w:lvlText w:val="o"/>
+      <w:lvlJc w:val="left"/>
+      <w:pPr>
+        <w:ind w:left="6120" w:hanging="360"/>
+      </w:pPr>
+      <w:rPr>
+        <w:rFonts w:ascii="Courier New" w:hAnsi="Courier New" w:cs="Courier New" w:hint="default"/>
+      </w:rPr>
+    </w:lvl>
+    <w:lvl w:ilvl="8" w:tplc="04090005" w:tentative="1">
+      <w:start w:val="1"/>
+      <w:numFmt w:val="bullet"/>
+      <w:lvlText w:val=""/>
+      <w:lvlJc w:val="left"/>
+      <w:pPr>
+        <w:ind w:left="6840" w:hanging="360"/>
+      </w:pPr>
+      <w:rPr>
+        <w:rFonts w:ascii="Wingdings" w:hAnsi="Wingdings" w:hint="default"/>
+      </w:rPr>
+    </w:lvl>
+  </w:abstractNum>
+  <w:abstractNum w:abstractNumId="19" w15:restartNumberingAfterBreak="0">
     <w:nsid w:val="6DF2304C"/>
     <w:multiLevelType w:val="hybridMultilevel"/>
     <w:tmpl w:val="337C7FE6"/>
@@ -4969,7 +5536,7 @@
       </w:pPr>
     </w:lvl>
   </w:abstractNum>
-  <w:abstractNum w:abstractNumId="19" w15:restartNumberingAfterBreak="0">
+  <w:abstractNum w:abstractNumId="20" w15:restartNumberingAfterBreak="0">
     <w:nsid w:val="70262649"/>
     <w:multiLevelType w:val="hybridMultilevel"/>
     <w:tmpl w:val="DA3CDEE6"/>
@@ -5055,7 +5622,7 @@
       </w:pPr>
     </w:lvl>
   </w:abstractNum>
-  <w:abstractNum w:abstractNumId="20" w15:restartNumberingAfterBreak="0">
+  <w:abstractNum w:abstractNumId="21" w15:restartNumberingAfterBreak="0">
     <w:nsid w:val="71517BD5"/>
     <w:multiLevelType w:val="hybridMultilevel"/>
     <w:tmpl w:val="C83C5F34"/>
@@ -5168,7 +5735,7 @@
       </w:rPr>
     </w:lvl>
   </w:abstractNum>
-  <w:abstractNum w:abstractNumId="21" w15:restartNumberingAfterBreak="0">
+  <w:abstractNum w:abstractNumId="22" w15:restartNumberingAfterBreak="0">
     <w:nsid w:val="71811F32"/>
     <w:multiLevelType w:val="hybridMultilevel"/>
     <w:tmpl w:val="07CA2C4E"/>
@@ -5281,7 +5848,7 @@
       </w:rPr>
     </w:lvl>
   </w:abstractNum>
-  <w:abstractNum w:abstractNumId="22" w15:restartNumberingAfterBreak="0">
+  <w:abstractNum w:abstractNumId="23" w15:restartNumberingAfterBreak="0">
     <w:nsid w:val="79A33DFE"/>
     <w:multiLevelType w:val="hybridMultilevel"/>
     <w:tmpl w:val="10700184"/>
@@ -5394,7 +5961,7 @@
       </w:rPr>
     </w:lvl>
   </w:abstractNum>
-  <w:abstractNum w:abstractNumId="23" w15:restartNumberingAfterBreak="0">
+  <w:abstractNum w:abstractNumId="24" w15:restartNumberingAfterBreak="0">
     <w:nsid w:val="7A182BC3"/>
     <w:multiLevelType w:val="multilevel"/>
     <w:tmpl w:val="3476E0F4"/>
@@ -5507,7 +6074,7 @@
       </w:rPr>
     </w:lvl>
   </w:abstractNum>
-  <w:abstractNum w:abstractNumId="24" w15:restartNumberingAfterBreak="0">
+  <w:abstractNum w:abstractNumId="25" w15:restartNumberingAfterBreak="0">
     <w:nsid w:val="7B7762A8"/>
     <w:multiLevelType w:val="hybridMultilevel"/>
     <w:tmpl w:val="C1CE738C"/>
@@ -5596,7 +6163,7 @@
       </w:pPr>
     </w:lvl>
   </w:abstractNum>
-  <w:abstractNum w:abstractNumId="25" w15:restartNumberingAfterBreak="0">
+  <w:abstractNum w:abstractNumId="26" w15:restartNumberingAfterBreak="0">
     <w:nsid w:val="7EE317B7"/>
     <w:multiLevelType w:val="multilevel"/>
     <w:tmpl w:val="EBF0FD44"/>
@@ -5719,7 +6286,7 @@
     <w:abstractNumId w:val="17"/>
   </w:num>
   <w:num w:numId="4" w16cid:durableId="24870113">
-    <w:abstractNumId w:val="24"/>
+    <w:abstractNumId w:val="25"/>
   </w:num>
   <w:num w:numId="5" w16cid:durableId="2083719434">
     <w:abstractNumId w:val="0"/>
@@ -5731,7 +6298,7 @@
     <w:abstractNumId w:val="15"/>
   </w:num>
   <w:num w:numId="8" w16cid:durableId="432167206">
-    <w:abstractNumId w:val="21"/>
+    <w:abstractNumId w:val="22"/>
   </w:num>
   <w:num w:numId="9" w16cid:durableId="2061173545">
     <w:abstractNumId w:val="2"/>
@@ -5740,10 +6307,10 @@
     <w:abstractNumId w:val="10"/>
   </w:num>
   <w:num w:numId="11" w16cid:durableId="677535900">
-    <w:abstractNumId w:val="22"/>
+    <w:abstractNumId w:val="23"/>
   </w:num>
   <w:num w:numId="12" w16cid:durableId="363676185">
-    <w:abstractNumId w:val="25"/>
+    <w:abstractNumId w:val="26"/>
   </w:num>
   <w:num w:numId="13" w16cid:durableId="1350452648">
     <w:abstractNumId w:val="7"/>
@@ -5758,10 +6325,10 @@
     <w:abstractNumId w:val="9"/>
   </w:num>
   <w:num w:numId="17" w16cid:durableId="1113744065">
-    <w:abstractNumId w:val="18"/>
+    <w:abstractNumId w:val="19"/>
   </w:num>
   <w:num w:numId="18" w16cid:durableId="303899053">
-    <w:abstractNumId w:val="23"/>
+    <w:abstractNumId w:val="24"/>
   </w:num>
   <w:num w:numId="19" w16cid:durableId="1559322532">
     <w:abstractNumId w:val="3"/>
@@ -5830,7 +6397,7 @@
     <w:abstractNumId w:val="3"/>
   </w:num>
   <w:num w:numId="23" w16cid:durableId="769468478">
-    <w:abstractNumId w:val="19"/>
+    <w:abstractNumId w:val="20"/>
   </w:num>
   <w:num w:numId="24" w16cid:durableId="385446020">
     <w:abstractNumId w:val="6"/>
@@ -5842,7 +6409,7 @@
     <w:abstractNumId w:val="3"/>
   </w:num>
   <w:num w:numId="27" w16cid:durableId="687219385">
-    <w:abstractNumId w:val="20"/>
+    <w:abstractNumId w:val="21"/>
   </w:num>
   <w:num w:numId="28" w16cid:durableId="460849350">
     <w:abstractNumId w:val="4"/>
@@ -5855,6 +6422,9 @@
   </w:num>
   <w:num w:numId="31" w16cid:durableId="1810588596">
     <w:abstractNumId w:val="8"/>
+  </w:num>
+  <w:num w:numId="32" w16cid:durableId="1357729446">
+    <w:abstractNumId w:val="18"/>
   </w:num>
 </w:numbering>
 </file>

</xml_diff>